<commit_message>
Checklist: confirmar decision de pedir 310.000€ y fecha objetivo de apertura (octubre 2026)
</commit_message>
<xml_diff>
--- a/entregables/LEGION_checklist_financiacion_inversion_v2.docx
+++ b/entregables/LEGION_checklist_financiacion_inversion_v2.docx
@@ -336,14 +336,15 @@
               <w:spacing w:after="0"/>
               <w:jc w:val="left"/>
             </w:pPr>
-            <w:r/>
+            <w:r>
+              <w:t>✓ DECISIÓN (9 jul 2026): 310.000 €, incluyendo tesorería inicial y margen de seguridad.</w:t>
+            </w:r>
             <w:r>
               <w:rPr>
                 <w:rFonts w:ascii="Liberation Sans" w:hAnsi="Liberation Sans" w:eastAsia="Liberation Sans"/>
                 <w:b w:val="0"/>
                 <w:sz w:val="17"/>
               </w:rPr>
-              <w:t>310.000 EUR, incluyendo tesorería inicial y margen de seguridad.</w:t>
             </w:r>
           </w:p>
         </w:tc>
@@ -4879,14 +4880,15 @@
               <w:spacing w:after="0"/>
               <w:jc w:val="left"/>
             </w:pPr>
-            <w:r/>
+            <w:r>
+              <w:t>310.000 € — objetivo total de la operación (repartir entre préstamo y capital según lo que se cierre).</w:t>
+            </w:r>
             <w:r>
               <w:rPr>
                 <w:rFonts w:ascii="Liberation Sans" w:hAnsi="Liberation Sans" w:eastAsia="Liberation Sans"/>
                 <w:b w:val="0"/>
                 <w:sz w:val="17"/>
               </w:rPr>
-              <w:t>Definir: 250.000, 310.000 o 350.000 EUR.</w:t>
             </w:r>
           </w:p>
         </w:tc>
@@ -4938,14 +4940,15 @@
               <w:spacing w:after="0"/>
               <w:jc w:val="left"/>
             </w:pPr>
-            <w:r/>
+            <w:r>
+              <w:t>6% anual (ilustrativo, a pactar con el prestamista).</w:t>
+            </w:r>
             <w:r>
               <w:rPr>
                 <w:rFonts w:ascii="Liberation Sans" w:hAnsi="Liberation Sans" w:eastAsia="Liberation Sans"/>
                 <w:b w:val="0"/>
                 <w:sz w:val="17"/>
               </w:rPr>
-              <w:t>Definir interés anual o rentabilidad fija.</w:t>
             </w:r>
           </w:p>
         </w:tc>
@@ -4997,14 +5000,15 @@
               <w:spacing w:after="0"/>
               <w:jc w:val="left"/>
             </w:pPr>
-            <w:r/>
+            <w:r>
+              <w:t>7-10 años según importe final (ver escenarios en pl-inversores.html).</w:t>
+            </w:r>
             <w:r>
               <w:rPr>
                 <w:rFonts w:ascii="Liberation Sans" w:hAnsi="Liberation Sans" w:eastAsia="Liberation Sans"/>
                 <w:b w:val="0"/>
                 <w:sz w:val="17"/>
               </w:rPr>
-              <w:t>Definir años de devolución.</w:t>
             </w:r>
           </w:p>
         </w:tc>
@@ -5056,14 +5060,15 @@
               <w:spacing w:after="0"/>
               <w:jc w:val="left"/>
             </w:pPr>
-            <w:r/>
+            <w:r>
+              <w:t>12 meses.</w:t>
+            </w:r>
             <w:r>
               <w:rPr>
                 <w:rFonts w:ascii="Liberation Sans" w:hAnsi="Liberation Sans" w:eastAsia="Liberation Sans"/>
                 <w:b w:val="0"/>
                 <w:sz w:val="17"/>
               </w:rPr>
-              <w:t>Definir si hay carencia hasta apertura o primeros meses.</w:t>
             </w:r>
           </w:p>
         </w:tc>
@@ -5115,14 +5120,15 @@
               <w:spacing w:after="0"/>
               <w:jc w:val="left"/>
             </w:pPr>
-            <w:r/>
+            <w:r>
+              <w:t>Se calcula en el Excel financiero (hoja Caja_Deuda) y en pl-inversores.html.</w:t>
+            </w:r>
             <w:r>
               <w:rPr>
                 <w:rFonts w:ascii="Liberation Sans" w:hAnsi="Liberation Sans" w:eastAsia="Liberation Sans"/>
                 <w:b w:val="0"/>
                 <w:sz w:val="17"/>
               </w:rPr>
-              <w:t>Calcular en el Excel según plazo e interés.</w:t>
             </w:r>
           </w:p>
         </w:tc>
@@ -5174,14 +5180,15 @@
               <w:spacing w:after="0"/>
               <w:jc w:val="left"/>
             </w:pPr>
-            <w:r/>
+            <w:r>
+              <w:t>Aval SGR (Avalis de Catalunya) + la propia instalación/maquinaria + la sociedad. Sin garantía personal de los socios.</w:t>
+            </w:r>
             <w:r>
               <w:rPr>
                 <w:rFonts w:ascii="Liberation Sans" w:hAnsi="Liberation Sans" w:eastAsia="Liberation Sans"/>
                 <w:b w:val="0"/>
                 <w:sz w:val="17"/>
               </w:rPr>
-              <w:t>Definir si hay aval, pagaré, garantía societaria o ninguna.</w:t>
             </w:r>
           </w:p>
         </w:tc>
@@ -5233,14 +5240,15 @@
               <w:spacing w:after="0"/>
               <w:jc w:val="left"/>
             </w:pPr>
-            <w:r/>
+            <w:r>
+              <w:t>A confirmar con el prestamista.</w:t>
+            </w:r>
             <w:r>
               <w:rPr>
                 <w:rFonts w:ascii="Liberation Sans" w:hAnsi="Liberation Sans" w:eastAsia="Liberation Sans"/>
                 <w:b w:val="0"/>
                 <w:sz w:val="17"/>
               </w:rPr>
-              <w:t>Aclarar prioridad frente a otros préstamos o deuda de socios.</w:t>
             </w:r>
           </w:p>
         </w:tc>
@@ -7845,7 +7853,7 @@
           <w:rFonts w:ascii="Liberation Sans" w:hAnsi="Liberation Sans" w:eastAsia="Liberation Sans"/>
           <w:sz w:val="19"/>
         </w:rPr>
-        <w:t>Fecha realista de apertura.</w:t>
+        <w:t>Fecha realista de apertura. → Objetivo: octubre 2026 (estimado, sujeto a tiempos de obra; aún no hay fecha cerrada).</w:t>
       </w:r>
     </w:p>
     <w:p>

</xml_diff>